<commit_message>
Record live Cloudflare Pages URL and update reports
</commit_message>
<xml_diff>
--- a/deliverables/AI_Cloud_Final_Report.docx
+++ b/deliverables/AI_Cloud_Final_Report.docx
@@ -263,7 +263,7 @@
           <w:rFonts w:ascii="Microsoft JhengHei" w:hAnsi="Microsoft JhengHei" w:eastAsia="Microsoft JhengHei"/>
           <w:b w:val="0"/>
         </w:rPr>
-        <w:t>此專案不使用資料庫、不需要 API Key，適合期末展示與雲端部署練習。原始碼已上傳至 GitHub，正式網站已部署至 Railway 並產生公開網址。</w:t>
+        <w:t>此專案不使用資料庫、不需要 API Key，適合期末展示與雲端部署練習。原始碼已上傳至 GitHub，正式網站已部署至 Cloudflare Pages 並產生公開網址。</w:t>
       </w:r>
     </w:p>
     <w:p>
@@ -307,7 +307,7 @@
                 <w:rFonts w:ascii="Microsoft JhengHei" w:hAnsi="Microsoft JhengHei" w:eastAsia="Microsoft JhengHei"/>
                 <w:b/>
               </w:rPr>
-              <w:t>✓ GitHub 已上傳</w:t>
+              <w:t>已完成：GitHub 已上傳</w:t>
             </w:r>
           </w:p>
         </w:tc>
@@ -327,7 +327,7 @@
                 <w:rFonts w:ascii="Microsoft JhengHei" w:hAnsi="Microsoft JhengHei" w:eastAsia="Microsoft JhengHei"/>
                 <w:b/>
               </w:rPr>
-              <w:t>✓ Railway 已部署</w:t>
+              <w:t>已完成：Cloudflare Pages 已部署</w:t>
             </w:r>
           </w:p>
         </w:tc>
@@ -347,7 +347,7 @@
                 <w:rFonts w:ascii="Microsoft JhengHei" w:hAnsi="Microsoft JhengHei" w:eastAsia="Microsoft JhengHei"/>
                 <w:b/>
               </w:rPr>
-              <w:t>✓ 公開網址可瀏覽</w:t>
+              <w:t>已完成：公開網址可瀏覽</w:t>
             </w:r>
           </w:p>
         </w:tc>
@@ -368,7 +368,7 @@
                 <w:rFonts w:ascii="Microsoft JhengHei" w:hAnsi="Microsoft JhengHei" w:eastAsia="Microsoft JhengHei"/>
                 <w:b/>
               </w:rPr>
-              <w:t>✓ Next.js 專案</w:t>
+              <w:t>已完成：Next.js 專案</w:t>
             </w:r>
           </w:p>
         </w:tc>
@@ -387,7 +387,7 @@
                 <w:rFonts w:ascii="Microsoft JhengHei" w:hAnsi="Microsoft JhengHei" w:eastAsia="Microsoft JhengHei"/>
                 <w:b/>
               </w:rPr>
-              <w:t>✓ 不需要 API Key</w:t>
+              <w:t>已完成：不需要 API Key</w:t>
             </w:r>
           </w:p>
         </w:tc>
@@ -406,7 +406,7 @@
                 <w:rFonts w:ascii="Microsoft JhengHei" w:hAnsi="Microsoft JhengHei" w:eastAsia="Microsoft JhengHei"/>
                 <w:b/>
               </w:rPr>
-              <w:t>✓ Build 已通過</w:t>
+              <w:t>已完成：Build 已通過</w:t>
             </w:r>
           </w:p>
         </w:tc>
@@ -463,7 +463,7 @@
         <w:pStyle w:val="ListBullet"/>
       </w:pPr>
       <w:r>
-        <w:t>首頁整理 GitHub、Railway、個人資料網站與 AEM電解槽最佳化專題互動網站等成果連結。</w:t>
+        <w:t>首頁整理 GitHub、Cloudflare Pages、個人資料網站與 AEM電解槽最佳化專題互動網站等成果連結。</w:t>
       </w:r>
     </w:p>
     <w:p>
@@ -689,7 +689,7 @@
               <w:rPr>
                 <w:rFonts w:ascii="Microsoft JhengHei" w:hAnsi="Microsoft JhengHei" w:eastAsia="Microsoft JhengHei"/>
               </w:rPr>
-              <w:t>Railway</w:t>
+              <w:t>Cloudflare Pages</w:t>
             </w:r>
           </w:p>
         </w:tc>
@@ -859,7 +859,7 @@
         <w:rPr>
           <w:rFonts w:ascii="Microsoft JhengHei" w:hAnsi="Microsoft JhengHei" w:eastAsia="Microsoft JhengHei"/>
         </w:rPr>
-        <w:t>在 Railway 建立專案並連接 GitHub Repository。</w:t>
+        <w:t>在 Cloudflare Pages 建立免費專案，連接 GitHub Repository，正式分支設為 main。</w:t>
       </w:r>
     </w:p>
     <w:p>
@@ -870,7 +870,7 @@
         <w:rPr>
           <w:rFonts w:ascii="Microsoft JhengHei" w:hAnsi="Microsoft JhengHei" w:eastAsia="Microsoft JhengHei"/>
         </w:rPr>
-        <w:t>Railway 自動安裝依賴、執行建置並部署網站。</w:t>
+        <w:t>建置指令設為 npm run build，輸出目錄設為 out，由 Cloudflare Pages 發佈靜態網站。</w:t>
       </w:r>
     </w:p>
     <w:p>
@@ -1019,7 +1019,7 @@
               <w:rPr>
                 <w:rFonts w:ascii="Microsoft JhengHei" w:hAnsi="Microsoft JhengHei" w:eastAsia="Microsoft JhengHei"/>
               </w:rPr>
-              <w:t>Railway 公開網站</w:t>
+              <w:t>Cloudflare Pages 公開網站</w:t>
             </w:r>
           </w:p>
         </w:tc>
@@ -1035,7 +1035,7 @@
                   <w:color w:val="2E74B5"/>
                   <w:u w:val="single"/>
                 </w:rPr>
-                <w:t>https://ai-cloud-project-generator-production.up.railway.app</w:t>
+                <w:t>https://ai-cloud-project-generator.pages.dev/</w:t>
               </w:r>
             </w:hyperlink>
           </w:p>
@@ -1215,7 +1215,7 @@
         <w:rPr>
           <w:rFonts w:ascii="Microsoft JhengHei" w:hAnsi="Microsoft JhengHei" w:eastAsia="Microsoft JhengHei"/>
         </w:rPr>
-        <w:t>Railway 公開網址可作為線上展示入口。</w:t>
+        <w:t>Cloudflare Pages 公開網址可作為線上展示入口。</w:t>
       </w:r>
     </w:p>
     <w:p>
@@ -1236,7 +1236,7 @@
           <w:rFonts w:ascii="Microsoft JhengHei" w:hAnsi="Microsoft JhengHei" w:eastAsia="Microsoft JhengHei"/>
           <w:b w:val="0"/>
         </w:rPr>
-        <w:t>本專案為 AI 雲端專題介紹生成器，使用 Next.js、TypeScript 與 Tailwind CSS 製作，並部署到 Railway。使用者輸入專題資訊後，系統會以前端邏輯模擬 AI，產生專題摘要、技術亮點、預期效益與雲端部署說明。專案不需要資料庫，也沒有使用 API Key，因此部署流程簡單穩定，適合雲端運算課程期末展示。</w:t>
+        <w:t>本專案為 AI 雲端專題介紹生成器，使用 Next.js、TypeScript 與 Tailwind CSS 製作，並部署到 Cloudflare Pages。使用者輸入專題資訊後，系統會以前端邏輯模擬 AI，產生專題摘要、技術亮點、預期效益與雲端部署說明。專案不需要資料庫，也沒有使用 API Key，因此部署流程簡單穩定，適合雲端運算課程期末展示。</w:t>
       </w:r>
     </w:p>
     <w:p>
@@ -1257,7 +1257,12 @@
           <w:rFonts w:ascii="Microsoft JhengHei" w:hAnsi="Microsoft JhengHei" w:eastAsia="Microsoft JhengHei"/>
           <w:b w:val="0"/>
         </w:rPr>
-        <w:t>本作品完成了從 Next.js 專案建立、前端互動設計、GitHub 原始碼管理到 Railway 雲端部署的完整流程，並將成果整理為公開可瀏覽的網站。整體專案符合期末作業要求，也具備清楚的展示流程與成果連結。</w:t>
+        <w:t>本作品完成了從 Next.js 專案建立、前端互動設計、GitHub 原始碼管理到 Cloudflare Pages 雲端部署的完整流程，並將成果整理為公開可瀏覽的網站。專案具備清楚的展示流程與成果連結；原作業指定 Railway，目前改用 Cloudflare Pages 展示，是否符合繳交規定仍依老師要求。</w:t>
+      </w:r>
+    </w:p>
+    <w:p>
+      <w:r>
+        <w:t>部署更新紀錄：2026-10-27，原 Railway 試用已到期、服務離線，改以 Cloudflare Pages 免費方案部署。本報告目前公開網址為 https://ai-cloud-project-generator.pages.dev/</w:t>
       </w:r>
     </w:p>
     <w:sectPr>

</xml_diff>